<commit_message>
docs: update lab 2 report for manual care conditions and label recognition
</commit_message>
<xml_diff>
--- a/reports/Лабораторная работа №2.docx
+++ b/reports/Лабораторная работа №2.docx
@@ -929,7 +929,7 @@
           <w:color w:val="000000"/>
           <w:sz w:val="28"/>
         </w:rPr>
-        <w:t xml:space="preserve"> реализовать часть варианта, выделенную лиловым цветом в исходном документе. Приложение должно отображать историю поливов, подкормок и пересадок, предоставлять справку об освещении и влажности, а также распознавать текстовое название растения с этикетки или ценника. Дополнительно требуется повторение назначенных процедур с интервалом в семь календарных дней.</w:t>
+        <w:t xml:space="preserve"> реализовать часть варианта, выделенную лиловым цветом в исходном документе. Приложение должно отображать историю поливов, подкормок и пересадок, предоставлять справку об освещении и влажности, а также распознавать текстовое название растения с этикетки или ценника. Дополнительно требуется повторение назначенных процедур с интервалом в 7 календарных дней.</w:t>
       </w:r>
     </w:p>
     <w:p>
@@ -1017,7 +1017,7 @@
           <w:color w:val="000000"/>
           <w:sz w:val="28"/>
         </w:rPr>
-        <w:t xml:space="preserve"> Данные текущего этапа хранятся в оперативной памяти. Реляционное хранилище, обращение к сетевой энциклопедии и локальные уведомления относятся к последующим лабораторным работам.</w:t>
+        <w:t xml:space="preserve"> Данные текущего этапа хранятся в оперативной памяти. Изменения сохраняются до полного перезапуска приложения. Постоянное хранилище, обращение к сетевой энциклопедии и локальные уведомления относятся к последующим лабораторным работам. Получение ботанической справки через сетевые запросы на данном этапе не реализуется.</w:t>
       </w:r>
     </w:p>
     <w:p>
@@ -1046,7 +1046,7 @@
           <w:color w:val="000000"/>
           <w:sz w:val="28"/>
         </w:rPr>
-        <w:t xml:space="preserve"> в форму назначения процедуры добавлена кнопка «Еженедельно». Состояние кнопки сохраняется вместе с датой начала, видом ухода и идентификатором растения. Для каждого выбранного дня проверяется, совпадает ли он с датой начала или с соответствующим днём недели после начала серии. Благодаря этому повторения отображаются в следующих месяцах и годах без создания бесконечного списка записей. Внешний вид формы с включённым повторением представлен на рисунке 1.</w:t>
+        <w:t xml:space="preserve"> в форму назначения процедуры добавлена кнопка «Еженедельно». Состояние кнопки сохраняется вместе с датой начала, видом ухода и идентификатором растения. Для каждого выбранного дня проверяется, совпадает ли он с датой начала или с соответствующим днём недели после начала серии. Благодаря этому повторения отображаются в следующих месяцах и годах без создания бесконечного списка записей. Внешний вид формы с включённым повторением представлен на рисунке 1.</w:t>
       </w:r>
     </w:p>
     <w:p>
@@ -1083,7 +1083,7 @@
       <w:r>
         <w:drawing>
           <wp:inline xmlns:a="http://schemas.openxmlformats.org/drawingml/2006/main" xmlns:pic="http://schemas.openxmlformats.org/drawingml/2006/picture">
-            <wp:extent cx="2304000" cy="5169542"/>
+            <wp:extent cx="2304000" cy="5117305"/>
             <wp:docPr id="1" name="Picture 1"/>
             <wp:cNvGraphicFramePr>
               <a:graphicFrameLocks noChangeAspect="1"/>
@@ -1104,7 +1104,7 @@
                   <pic:spPr>
                     <a:xfrm>
                       <a:off x="0" y="0"/>
-                      <a:ext cx="2304000" cy="5169542"/>
+                      <a:ext cx="2304000" cy="5117305"/>
                     </a:xfrm>
                     <a:prstGeom prst="rect"/>
                   </pic:spPr>
@@ -1191,7 +1191,7 @@
           <w:color w:val="000000"/>
           <w:sz w:val="28"/>
         </w:rPr>
-        <w:t>После сохранения серии в календаре выбран день следующей недели. Для этого дня отображается та же процедура с отметкой «Еженедельно». Выполнение отдельного полива не завершает будущие повторения: состояние выполнения хранится для каждой даты отдельно. Редактирование и удаление повторяющейся процедуры применяются ко всей серии, что поясняется в интерфейсе. Результат отображения следующего повторения представлен на рисунке 2.</w:t>
+        <w:t>После сохранения серии в календаре выбран день следующей недели. Для этого дня отображается та же процедура с отметкой «Еженедельно». Выполнение отдельного полива не завершает будущие повторения: состояние выполнения хранится для каждой даты отдельно. Редактирование и удаление повторяющейся процедуры применяются ко всей серии, что поясняется в интерфейсе. Результат отображения следующего повторения представлен на рисунке 2.</w:t>
       </w:r>
     </w:p>
     <w:p>
@@ -1228,7 +1228,7 @@
       <w:r>
         <w:drawing>
           <wp:inline xmlns:a="http://schemas.openxmlformats.org/drawingml/2006/main" xmlns:pic="http://schemas.openxmlformats.org/drawingml/2006/picture">
-            <wp:extent cx="2304000" cy="5169542"/>
+            <wp:extent cx="2304000" cy="5117305"/>
             <wp:docPr id="2" name="Picture 2"/>
             <wp:cNvGraphicFramePr>
               <a:graphicFrameLocks noChangeAspect="1"/>
@@ -1249,7 +1249,7 @@
                   <pic:spPr>
                     <a:xfrm>
                       <a:off x="0" y="0"/>
-                      <a:ext cx="2304000" cy="5169542"/>
+                      <a:ext cx="2304000" cy="5117305"/>
                     </a:xfrm>
                     <a:prstGeom prst="rect"/>
                   </pic:spPr>
@@ -1336,7 +1336,7 @@
           <w:color w:val="000000"/>
           <w:sz w:val="28"/>
         </w:rPr>
-        <w:t xml:space="preserve">Для просмотра дополнительных сведений создан отдельный экран растения. Переход на него выполняется через действие «Справка и журнал ухода» на карточке каталога. На экране отображаются название, ботаническое имя и помещение. Ботаническая справка загружается из включённого в приложение файла </w:t>
+        <w:t xml:space="preserve">Для просмотра дополнительных сведений создан отдельный экран растения. Переход на него выполняется через действие «Справка и журнал ухода» на карточке каталога. На экране отображаются название, ботаническое имя и помещение. Условия содержания выводятся из записи растения, если пользователь ввёл их самостоятельно. При отсутствии такого текста используется локальный ботанический справочник, включённый в приложение в формате </w:t>
       </w:r>
       <w:r>
         <w:rPr>
@@ -1345,7 +1345,7 @@
           <w:color w:val="000000"/>
           <w:sz w:val="28"/>
         </w:rPr>
-        <w:t>JSON</w:t>
+        <w:t>JSON.</w:t>
       </w:r>
       <w:r>
         <w:rPr>
@@ -1353,7 +1353,24 @@
           <w:color w:val="000000"/>
           <w:sz w:val="28"/>
         </w:rPr>
-        <w:t>, сопоставляется с видом растения и содержит сведения об освещении и влажности. Переименование пользовательского названия не изменяет ботанический вид. При отсутствии известного вида выводится сообщение об отсутствии сведений. Результат реализации справки для монстеры представлен на рисунке 3.</w:t>
+        <w:t xml:space="preserve"> Он содержит сведения об освещении и влажности для 5 наименований растений. Поиск выполняется по ботаническому имени и допустимым вариантам названия. Сведения для монстеры, фикуса, спатифиллума и драцены подготовлены по материалам Королевского садоводческого общества, а общие условия для рода </w:t>
+      </w:r>
+      <w:r>
+        <w:rPr>
+          <w:rFonts w:ascii="Times New Roman" w:hAnsi="Times New Roman"/>
+          <w:i/>
+          <w:color w:val="000000"/>
+          <w:sz w:val="28"/>
+        </w:rPr>
+        <w:t>Aglaonema</w:t>
+      </w:r>
+      <w:r>
+        <w:rPr>
+          <w:rFonts w:ascii="Times New Roman" w:hAnsi="Times New Roman"/>
+          <w:color w:val="000000"/>
+          <w:sz w:val="28"/>
+        </w:rPr>
+        <w:t xml:space="preserve"> – по материалам Университета штата Северная Каролина. Название источника выводится вместе со справкой. Файл читается из ресурсов приложения без обращения к Интернету. При отсутствии подходящей записи предлагается ввести условия вручную или проверить название вида. Результат реализации справки для монстеры представлен на рисунке 3.</w:t>
       </w:r>
     </w:p>
     <w:p>
@@ -1390,7 +1407,7 @@
       <w:r>
         <w:drawing>
           <wp:inline xmlns:a="http://schemas.openxmlformats.org/drawingml/2006/main" xmlns:pic="http://schemas.openxmlformats.org/drawingml/2006/picture">
-            <wp:extent cx="2304000" cy="5169542"/>
+            <wp:extent cx="2304000" cy="5117305"/>
             <wp:docPr id="3" name="Picture 3"/>
             <wp:cNvGraphicFramePr>
               <a:graphicFrameLocks noChangeAspect="1"/>
@@ -1411,7 +1428,7 @@
                   <pic:spPr>
                     <a:xfrm>
                       <a:off x="0" y="0"/>
-                      <a:ext cx="2304000" cy="5169542"/>
+                      <a:ext cx="2304000" cy="5117305"/>
                     </a:xfrm>
                     <a:prstGeom prst="rect"/>
                   </pic:spPr>
@@ -1498,7 +1515,75 @@
           <w:color w:val="000000"/>
           <w:sz w:val="28"/>
         </w:rPr>
-        <w:t>Для журнала создана самостоятельная модель фактически выполненной процедуры. Она содержит идентификатор растения, вид ухода, дату выполнения и примечание. История сортируется от более поздних записей к ранним. Данные журнала отделены от будущего расписания, поэтому удаление назначенной процедуры не удаляет сведения о ранее выполненном уходе. Начальные записи для демонстрации явно обозначены в интерфейсе. Результат просмотра истории поливов, подкормок и пересадок представлен на рисунке 4.</w:t>
+        <w:t xml:space="preserve">Для самостоятельного заполнения условий содержания в модель </w:t>
+      </w:r>
+      <w:r>
+        <w:rPr>
+          <w:rFonts w:ascii="Times New Roman" w:hAnsi="Times New Roman"/>
+          <w:i/>
+          <w:color w:val="000000"/>
+          <w:sz w:val="28"/>
+        </w:rPr>
+        <w:t>Plant</w:t>
+      </w:r>
+      <w:r>
+        <w:rPr>
+          <w:rFonts w:ascii="Times New Roman" w:hAnsi="Times New Roman"/>
+          <w:color w:val="000000"/>
+          <w:sz w:val="28"/>
+        </w:rPr>
+        <w:t xml:space="preserve"> добавлено строковое свойство </w:t>
+      </w:r>
+      <w:r>
+        <w:rPr>
+          <w:rFonts w:ascii="Times New Roman" w:hAnsi="Times New Roman"/>
+          <w:i/>
+          <w:color w:val="000000"/>
+          <w:sz w:val="28"/>
+        </w:rPr>
+        <w:t>careConditions.</w:t>
+      </w:r>
+      <w:r>
+        <w:rPr>
+          <w:rFonts w:ascii="Times New Roman" w:hAnsi="Times New Roman"/>
+          <w:color w:val="000000"/>
+          <w:sz w:val="28"/>
+        </w:rPr>
+        <w:t xml:space="preserve"> В форму добавления растения включено многострочное поле «Условия содержания». Введённый текст передаётся методу </w:t>
+      </w:r>
+      <w:r>
+        <w:rPr>
+          <w:rFonts w:ascii="Times New Roman" w:hAnsi="Times New Roman"/>
+          <w:i/>
+          <w:color w:val="000000"/>
+          <w:sz w:val="28"/>
+        </w:rPr>
+        <w:t>savePlant</w:t>
+      </w:r>
+      <w:r>
+        <w:rPr>
+          <w:rFonts w:ascii="Times New Roman" w:hAnsi="Times New Roman"/>
+          <w:color w:val="000000"/>
+          <w:sz w:val="28"/>
+        </w:rPr>
+        <w:t xml:space="preserve"> класса </w:t>
+      </w:r>
+      <w:r>
+        <w:rPr>
+          <w:rFonts w:ascii="Times New Roman" w:hAnsi="Times New Roman"/>
+          <w:i/>
+          <w:color w:val="000000"/>
+          <w:sz w:val="28"/>
+        </w:rPr>
+        <w:t>GardenViewModel</w:t>
+      </w:r>
+      <w:r>
+        <w:rPr>
+          <w:rFonts w:ascii="Times New Roman" w:hAnsi="Times New Roman"/>
+          <w:color w:val="000000"/>
+          <w:sz w:val="28"/>
+        </w:rPr>
+        <w:t>, который удаляет пробелы по краям и проверяет ограничение в 2000 символов. При проверке создана аглаонема с указанием ботанического имени, комнаты, освещения и влажности воздуха. Результат заполнения формы представлен на рисунке 4.</w:t>
       </w:r>
     </w:p>
     <w:p>
@@ -1535,7 +1620,7 @@
       <w:r>
         <w:drawing>
           <wp:inline xmlns:a="http://schemas.openxmlformats.org/drawingml/2006/main" xmlns:pic="http://schemas.openxmlformats.org/drawingml/2006/picture">
-            <wp:extent cx="2304000" cy="5169542"/>
+            <wp:extent cx="2304000" cy="5117305"/>
             <wp:docPr id="4" name="Picture 4"/>
             <wp:cNvGraphicFramePr>
               <a:graphicFrameLocks noChangeAspect="1"/>
@@ -1544,7 +1629,7 @@
               <a:graphicData uri="http://schemas.openxmlformats.org/drawingml/2006/picture">
                 <pic:pic>
                   <pic:nvPicPr>
-                    <pic:cNvPr id="0" name="04_care_history.png"/>
+                    <pic:cNvPr id="0" name="04_manual_add.png"/>
                     <pic:cNvPicPr/>
                   </pic:nvPicPr>
                   <pic:blipFill>
@@ -1556,7 +1641,7 @@
                   <pic:spPr>
                     <a:xfrm>
                       <a:off x="0" y="0"/>
-                      <a:ext cx="2304000" cy="5169542"/>
+                      <a:ext cx="2304000" cy="5117305"/>
                     </a:xfrm>
                     <a:prstGeom prst="rect"/>
                   </pic:spPr>
@@ -1604,7 +1689,7 @@
           <w:color w:val="000000"/>
           <w:sz w:val="28"/>
         </w:rPr>
-        <w:t>Рисунок 4 – Журнал ухода за растением</w:t>
+        <w:t>Рисунок 4 – Ввод условий содержания при добавлении растения</w:t>
       </w:r>
     </w:p>
     <w:p>
@@ -1643,7 +1728,41 @@
           <w:color w:val="000000"/>
           <w:sz w:val="28"/>
         </w:rPr>
-        <w:t>Для пополнения истории реализована форма «Записать уход». В форме выбираются вид процедуры и дата фактического выполнения, а также вводится примечание. Будущая дата недоступна для записи выполненного действия. Перед сохранением проверяется отсутствие одинакового вида ухода для этого растения за выбранный день. Сохранение полива закрывает соответствующие просроченные и сегодняшние назначения, сохраняя будущие даты. Результат ввода записи представлен на рисунке 5.</w:t>
+        <w:t xml:space="preserve">В форме редактирования используется то же поле. При открытии его управляющий объект </w:t>
+      </w:r>
+      <w:r>
+        <w:rPr>
+          <w:rFonts w:ascii="Times New Roman" w:hAnsi="Times New Roman"/>
+          <w:i/>
+          <w:color w:val="000000"/>
+          <w:sz w:val="28"/>
+        </w:rPr>
+        <w:t>TextEditingController</w:t>
+      </w:r>
+      <w:r>
+        <w:rPr>
+          <w:rFonts w:ascii="Times New Roman" w:hAnsi="Times New Roman"/>
+          <w:color w:val="000000"/>
+          <w:sz w:val="28"/>
+        </w:rPr>
+        <w:t xml:space="preserve"> получает ранее сохранённый текст, поэтому условия можно исправить без повторного ввода остальных сведений. После изменения текста вызывается </w:t>
+      </w:r>
+      <w:r>
+        <w:rPr>
+          <w:rFonts w:ascii="Times New Roman" w:hAnsi="Times New Roman"/>
+          <w:i/>
+          <w:color w:val="000000"/>
+          <w:sz w:val="28"/>
+        </w:rPr>
+        <w:t>savePlant</w:t>
+      </w:r>
+      <w:r>
+        <w:rPr>
+          <w:rFonts w:ascii="Times New Roman" w:hAnsi="Times New Roman"/>
+          <w:color w:val="000000"/>
+          <w:sz w:val="28"/>
+        </w:rPr>
+        <w:t xml:space="preserve"> с идентификатором существующего растения. Во время проверки к условиям добавлено указание о защите от прямых солнечных лучей. Результат редактирования представлен на рисунке 5.</w:t>
       </w:r>
     </w:p>
     <w:p>
@@ -1680,7 +1799,7 @@
       <w:r>
         <w:drawing>
           <wp:inline xmlns:a="http://schemas.openxmlformats.org/drawingml/2006/main" xmlns:pic="http://schemas.openxmlformats.org/drawingml/2006/picture">
-            <wp:extent cx="2304000" cy="5169542"/>
+            <wp:extent cx="2304000" cy="5117305"/>
             <wp:docPr id="5" name="Picture 5"/>
             <wp:cNvGraphicFramePr>
               <a:graphicFrameLocks noChangeAspect="1"/>
@@ -1689,7 +1808,7 @@
               <a:graphicData uri="http://schemas.openxmlformats.org/drawingml/2006/picture">
                 <pic:pic>
                   <pic:nvPicPr>
-                    <pic:cNvPr id="0" name="05_record_care.png"/>
+                    <pic:cNvPr id="0" name="05_manual_edit.png"/>
                     <pic:cNvPicPr/>
                   </pic:nvPicPr>
                   <pic:blipFill>
@@ -1701,7 +1820,7 @@
                   <pic:spPr>
                     <a:xfrm>
                       <a:off x="0" y="0"/>
-                      <a:ext cx="2304000" cy="5169542"/>
+                      <a:ext cx="2304000" cy="5117305"/>
                     </a:xfrm>
                     <a:prstGeom prst="rect"/>
                   </pic:spPr>
@@ -1749,7 +1868,7 @@
           <w:color w:val="000000"/>
           <w:sz w:val="28"/>
         </w:rPr>
-        <w:t>Рисунок 5 – Добавление записи выполненного ухода</w:t>
+        <w:t>Рисунок 5 – Редактирование условий содержания растения</w:t>
       </w:r>
     </w:p>
     <w:p>
@@ -1788,7 +1907,41 @@
           <w:color w:val="000000"/>
           <w:sz w:val="28"/>
         </w:rPr>
-        <w:t>В журнал добавлен выбор вида процедуры. При выборе «Полив» отображаются только записи полива, а при выборе «Все» восстанавливается полный журнал. После сохранения новой записи изменения видны без повторного открытия экрана, поскольку модель представления уведомляет подписанное представление. Результат фильтрации с новой записью представлен на рисунке 6.</w:t>
+        <w:t xml:space="preserve">На детальном экране введённый текст имеет приоритет перед локальным справочником и сопровождается сообщением «Сведения введены пользователем». Если поле очистить, вновь используется справочник. Для сохранения условий при отметке полива и обновлении календаря свойство </w:t>
+      </w:r>
+      <w:r>
+        <w:rPr>
+          <w:rFonts w:ascii="Times New Roman" w:hAnsi="Times New Roman"/>
+          <w:i/>
+          <w:color w:val="000000"/>
+          <w:sz w:val="28"/>
+        </w:rPr>
+        <w:t>careConditions</w:t>
+      </w:r>
+      <w:r>
+        <w:rPr>
+          <w:rFonts w:ascii="Times New Roman" w:hAnsi="Times New Roman"/>
+          <w:color w:val="000000"/>
+          <w:sz w:val="28"/>
+        </w:rPr>
+        <w:t xml:space="preserve"> передаётся при подготовке актуальных объектов </w:t>
+      </w:r>
+      <w:r>
+        <w:rPr>
+          <w:rFonts w:ascii="Times New Roman" w:hAnsi="Times New Roman"/>
+          <w:i/>
+          <w:color w:val="000000"/>
+          <w:sz w:val="28"/>
+        </w:rPr>
+        <w:t>Plant.</w:t>
+      </w:r>
+      <w:r>
+        <w:rPr>
+          <w:rFonts w:ascii="Times New Roman" w:hAnsi="Times New Roman"/>
+          <w:color w:val="000000"/>
+          <w:sz w:val="28"/>
+        </w:rPr>
+        <w:t xml:space="preserve"> Таким образом, сведения о содержании не теряются при выполнении других действий с растением. Результат просмотра изменённой справки представлен на рисунке 6.</w:t>
       </w:r>
     </w:p>
     <w:p>
@@ -1825,7 +1978,7 @@
       <w:r>
         <w:drawing>
           <wp:inline xmlns:a="http://schemas.openxmlformats.org/drawingml/2006/main" xmlns:pic="http://schemas.openxmlformats.org/drawingml/2006/picture">
-            <wp:extent cx="2304000" cy="5169542"/>
+            <wp:extent cx="2304000" cy="5117305"/>
             <wp:docPr id="6" name="Picture 6"/>
             <wp:cNvGraphicFramePr>
               <a:graphicFrameLocks noChangeAspect="1"/>
@@ -1834,7 +1987,7 @@
               <a:graphicData uri="http://schemas.openxmlformats.org/drawingml/2006/picture">
                 <pic:pic>
                   <pic:nvPicPr>
-                    <pic:cNvPr id="0" name="06_history_filter.png"/>
+                    <pic:cNvPr id="0" name="06_manual_profile.png"/>
                     <pic:cNvPicPr/>
                   </pic:nvPicPr>
                   <pic:blipFill>
@@ -1846,7 +1999,7 @@
                   <pic:spPr>
                     <a:xfrm>
                       <a:off x="0" y="0"/>
-                      <a:ext cx="2304000" cy="5169542"/>
+                      <a:ext cx="2304000" cy="5117305"/>
                     </a:xfrm>
                     <a:prstGeom prst="rect"/>
                   </pic:spPr>
@@ -1894,7 +2047,7 @@
           <w:color w:val="000000"/>
           <w:sz w:val="28"/>
         </w:rPr>
-        <w:t>Рисунок 6 – Фильтрация истории полива</w:t>
+        <w:t>Рисунок 6 – Справка с условиями, введёнными пользователем</w:t>
       </w:r>
     </w:p>
     <w:p>
@@ -1933,7 +2086,7 @@
           <w:color w:val="000000"/>
           <w:sz w:val="28"/>
         </w:rPr>
-        <w:t>Для автоматизированного добавления создан экран распознавания этикетки. Пользователь может получить изображение через системную камеру, выбрать его из галереи либо использовать встроенный образец при работе в эмуляторе. Встроенные изображения содержат текстовые названия монстеры, фикуса и спатифиллума и проходят тот же распознаватель, что и снимок камеры. Набор источников изображения представлен на рисунке 7.</w:t>
+        <w:t>Для журнала создана самостоятельная модель фактически выполненной процедуры. Она содержит идентификатор растения, вид ухода, дату выполнения и примечание. История сортируется от более поздних записей к ранним. Данные журнала отделены от будущего расписания, поэтому удаление назначенной процедуры не удаляет сведения о ранее выполненном уходе. Начальные записи для демонстрации явно обозначены в интерфейсе. Результат просмотра истории поливов, подкормок и пересадок представлен на рисунке 7.</w:t>
       </w:r>
     </w:p>
     <w:p>
@@ -1970,7 +2123,7 @@
       <w:r>
         <w:drawing>
           <wp:inline xmlns:a="http://schemas.openxmlformats.org/drawingml/2006/main" xmlns:pic="http://schemas.openxmlformats.org/drawingml/2006/picture">
-            <wp:extent cx="2304000" cy="5169542"/>
+            <wp:extent cx="2304000" cy="5117305"/>
             <wp:docPr id="7" name="Picture 7"/>
             <wp:cNvGraphicFramePr>
               <a:graphicFrameLocks noChangeAspect="1"/>
@@ -1979,7 +2132,7 @@
               <a:graphicData uri="http://schemas.openxmlformats.org/drawingml/2006/picture">
                 <pic:pic>
                   <pic:nvPicPr>
-                    <pic:cNvPr id="0" name="07_label_sources.png"/>
+                    <pic:cNvPr id="0" name="07_care_history.png"/>
                     <pic:cNvPicPr/>
                   </pic:nvPicPr>
                   <pic:blipFill>
@@ -1991,7 +2144,7 @@
                   <pic:spPr>
                     <a:xfrm>
                       <a:off x="0" y="0"/>
-                      <a:ext cx="2304000" cy="5169542"/>
+                      <a:ext cx="2304000" cy="5117305"/>
                     </a:xfrm>
                     <a:prstGeom prst="rect"/>
                   </pic:spPr>
@@ -2039,7 +2192,7 @@
           <w:color w:val="000000"/>
           <w:sz w:val="28"/>
         </w:rPr>
-        <w:t>Рисунок 7 – Выбор источника изображения этикетки</w:t>
+        <w:t>Рисунок 7 – Журнал ухода за растением</w:t>
       </w:r>
     </w:p>
     <w:p>
@@ -2078,58 +2231,7 @@
           <w:color w:val="000000"/>
           <w:sz w:val="28"/>
         </w:rPr>
-        <w:t xml:space="preserve">Распознавание выполняется на устройстве с помощью </w:t>
-      </w:r>
-      <w:r>
-        <w:rPr>
-          <w:rFonts w:ascii="Times New Roman" w:hAnsi="Times New Roman"/>
-          <w:i/>
-          <w:color w:val="000000"/>
-          <w:sz w:val="28"/>
-        </w:rPr>
-        <w:t>Google</w:t>
-      </w:r>
-      <w:r>
-        <w:rPr>
-          <w:rFonts w:ascii="Times New Roman" w:hAnsi="Times New Roman"/>
-          <w:color w:val="000000"/>
-          <w:sz w:val="28"/>
-        </w:rPr>
-        <w:t xml:space="preserve"> </w:t>
-      </w:r>
-      <w:r>
-        <w:rPr>
-          <w:rFonts w:ascii="Times New Roman" w:hAnsi="Times New Roman"/>
-          <w:i/>
-          <w:color w:val="000000"/>
-          <w:sz w:val="28"/>
-        </w:rPr>
-        <w:t>ML</w:t>
-      </w:r>
-      <w:r>
-        <w:rPr>
-          <w:rFonts w:ascii="Times New Roman" w:hAnsi="Times New Roman"/>
-          <w:color w:val="000000"/>
-          <w:sz w:val="28"/>
-        </w:rPr>
-        <w:t xml:space="preserve"> </w:t>
-      </w:r>
-      <w:r>
-        <w:rPr>
-          <w:rFonts w:ascii="Times New Roman" w:hAnsi="Times New Roman"/>
-          <w:i/>
-          <w:color w:val="000000"/>
-          <w:sz w:val="28"/>
-        </w:rPr>
-        <w:t>Kit.</w:t>
-      </w:r>
-      <w:r>
-        <w:rPr>
-          <w:rFonts w:ascii="Times New Roman" w:hAnsi="Times New Roman"/>
-          <w:color w:val="000000"/>
-          <w:sz w:val="28"/>
-        </w:rPr>
-        <w:t xml:space="preserve"> В текущей реализации используется распознавание латинского письма, поэтому для съёмки требуется этикетка с латинским ботаническим названием. Из полученных строк выделяется название растения, а цена и служебный текст исключаются. Пользователь видит исходный распознанный текст и может исправить название и вид перед добавлением в каталог. Распознанный вид связывается с локальной справкой при наличии соответствующей записи. Результат обработки изображения монстеры представлен на рисунке 8.</w:t>
+        <w:t>Для пополнения истории реализована форма «Записать уход». В форме выбираются вид процедуры и дата фактического выполнения, а также вводится примечание. Будущая дата недоступна для записи выполненного действия. Перед сохранением проверяется отсутствие одинакового вида ухода для этого растения за выбранный день. Сохранение полива закрывает соответствующие просроченные и сегодняшние назначения, сохраняя будущие даты. Результат ввода записи представлен на рисунке 8.</w:t>
       </w:r>
     </w:p>
     <w:p>
@@ -2166,7 +2268,7 @@
       <w:r>
         <w:drawing>
           <wp:inline xmlns:a="http://schemas.openxmlformats.org/drawingml/2006/main" xmlns:pic="http://schemas.openxmlformats.org/drawingml/2006/picture">
-            <wp:extent cx="2304000" cy="5169542"/>
+            <wp:extent cx="2304000" cy="5117305"/>
             <wp:docPr id="8" name="Picture 8"/>
             <wp:cNvGraphicFramePr>
               <a:graphicFrameLocks noChangeAspect="1"/>
@@ -2175,7 +2277,7 @@
               <a:graphicData uri="http://schemas.openxmlformats.org/drawingml/2006/picture">
                 <pic:pic>
                   <pic:nvPicPr>
-                    <pic:cNvPr id="0" name="08_label_result.png"/>
+                    <pic:cNvPr id="0" name="08_record_care.png"/>
                     <pic:cNvPicPr/>
                   </pic:nvPicPr>
                   <pic:blipFill>
@@ -2187,7 +2289,7 @@
                   <pic:spPr>
                     <a:xfrm>
                       <a:off x="0" y="0"/>
-                      <a:ext cx="2304000" cy="5169542"/>
+                      <a:ext cx="2304000" cy="5117305"/>
                     </a:xfrm>
                     <a:prstGeom prst="rect"/>
                   </pic:spPr>
@@ -2235,7 +2337,885 @@
           <w:color w:val="000000"/>
           <w:sz w:val="28"/>
         </w:rPr>
-        <w:t>Рисунок 8 – Распознанное название и подтверждение добавления</w:t>
+        <w:t>Рисунок 8 – Добавление записи выполненного ухода</w:t>
+      </w:r>
+    </w:p>
+    <w:p>
+      <w:pPr>
+        <w:keepNext w:val="0"/>
+        <w:spacing w:before="0" w:after="0" w:line="240" w:lineRule="auto"/>
+        <w:ind w:firstLine="0" w:left="0" w:right="0"/>
+        <w:rPr>
+          <w:rFonts w:ascii="Times New Roman" w:hAnsi="Times New Roman" w:cs="Times New Roman"/>
+          <w:sz w:val="28"/>
+          <w:szCs w:val="28"/>
+        </w:rPr>
+      </w:pPr>
+      <w:r>
+        <w:rPr>
+          <w:rFonts w:ascii="Times New Roman" w:hAnsi="Times New Roman"/>
+          <w:color w:val="000000"/>
+          <w:sz w:val="28"/>
+        </w:rPr>
+      </w:r>
+    </w:p>
+    <w:p>
+      <w:pPr>
+        <w:spacing w:before="0" w:after="0" w:line="240" w:lineRule="auto"/>
+        <w:ind w:firstLine="709" w:left="0" w:right="0"/>
+        <w:jc w:val="both"/>
+        <w:rPr>
+          <w:rFonts w:ascii="Times New Roman" w:hAnsi="Times New Roman" w:cs="Times New Roman"/>
+          <w:sz w:val="28"/>
+          <w:szCs w:val="28"/>
+        </w:rPr>
+      </w:pPr>
+      <w:r>
+        <w:rPr>
+          <w:rFonts w:ascii="Times New Roman" w:hAnsi="Times New Roman"/>
+          <w:color w:val="000000"/>
+          <w:sz w:val="28"/>
+        </w:rPr>
+        <w:t>В журнал добавлен выбор вида процедуры. При выборе «Полив» отображаются только записи полива, а при выборе «Все» восстанавливается полный журнал. После сохранения новой записи изменения видны без повторного открытия экрана, поскольку модель представления уведомляет подписанное представление. Результат фильтрации с новой записью представлен на рисунке 9.</w:t>
+      </w:r>
+    </w:p>
+    <w:p>
+      <w:pPr>
+        <w:keepNext/>
+        <w:spacing w:before="0" w:after="0" w:line="240" w:lineRule="auto"/>
+        <w:ind w:firstLine="0" w:left="0" w:right="0"/>
+        <w:rPr>
+          <w:rFonts w:ascii="Times New Roman" w:hAnsi="Times New Roman" w:cs="Times New Roman"/>
+          <w:sz w:val="28"/>
+          <w:szCs w:val="28"/>
+        </w:rPr>
+      </w:pPr>
+      <w:r>
+        <w:rPr>
+          <w:rFonts w:ascii="Times New Roman" w:hAnsi="Times New Roman"/>
+          <w:color w:val="000000"/>
+          <w:sz w:val="28"/>
+        </w:rPr>
+      </w:r>
+    </w:p>
+    <w:p>
+      <w:pPr>
+        <w:keepNext/>
+        <w:spacing w:before="0" w:after="0" w:line="240" w:lineRule="auto"/>
+        <w:ind w:firstLine="0" w:left="0" w:right="0"/>
+        <w:jc w:val="center"/>
+        <w:rPr>
+          <w:rFonts w:ascii="Times New Roman" w:hAnsi="Times New Roman" w:cs="Times New Roman"/>
+          <w:sz w:val="28"/>
+          <w:szCs w:val="28"/>
+        </w:rPr>
+      </w:pPr>
+      <w:r>
+        <w:drawing>
+          <wp:inline xmlns:a="http://schemas.openxmlformats.org/drawingml/2006/main" xmlns:pic="http://schemas.openxmlformats.org/drawingml/2006/picture">
+            <wp:extent cx="2304000" cy="5117305"/>
+            <wp:docPr id="9" name="Picture 9"/>
+            <wp:cNvGraphicFramePr>
+              <a:graphicFrameLocks noChangeAspect="1"/>
+            </wp:cNvGraphicFramePr>
+            <a:graphic>
+              <a:graphicData uri="http://schemas.openxmlformats.org/drawingml/2006/picture">
+                <pic:pic>
+                  <pic:nvPicPr>
+                    <pic:cNvPr id="0" name="09_history_filter.png"/>
+                    <pic:cNvPicPr/>
+                  </pic:nvPicPr>
+                  <pic:blipFill>
+                    <a:blip r:embed="rId17"/>
+                    <a:stretch>
+                      <a:fillRect/>
+                    </a:stretch>
+                  </pic:blipFill>
+                  <pic:spPr>
+                    <a:xfrm>
+                      <a:off x="0" y="0"/>
+                      <a:ext cx="2304000" cy="5117305"/>
+                    </a:xfrm>
+                    <a:prstGeom prst="rect"/>
+                  </pic:spPr>
+                </pic:pic>
+              </a:graphicData>
+            </a:graphic>
+          </wp:inline>
+        </w:drawing>
+      </w:r>
+    </w:p>
+    <w:p>
+      <w:pPr>
+        <w:keepNext/>
+        <w:spacing w:before="0" w:after="0" w:line="240" w:lineRule="auto"/>
+        <w:ind w:firstLine="0" w:left="0" w:right="0"/>
+        <w:rPr>
+          <w:rFonts w:ascii="Times New Roman" w:hAnsi="Times New Roman" w:cs="Times New Roman"/>
+          <w:sz w:val="28"/>
+          <w:szCs w:val="28"/>
+        </w:rPr>
+      </w:pPr>
+      <w:r>
+        <w:rPr>
+          <w:rFonts w:ascii="Times New Roman" w:hAnsi="Times New Roman"/>
+          <w:color w:val="000000"/>
+          <w:sz w:val="28"/>
+        </w:rPr>
+      </w:r>
+    </w:p>
+    <w:p>
+      <w:pPr>
+        <w:keepLines/>
+        <w:spacing w:before="0" w:after="0" w:line="240" w:lineRule="auto"/>
+        <w:ind w:firstLine="0" w:left="0" w:right="0"/>
+        <w:jc w:val="center"/>
+        <w:rPr>
+          <w:rFonts w:ascii="Times New Roman" w:hAnsi="Times New Roman" w:cs="Times New Roman"/>
+          <w:sz w:val="28"/>
+          <w:szCs w:val="28"/>
+        </w:rPr>
+      </w:pPr>
+      <w:r>
+        <w:rPr>
+          <w:rFonts w:ascii="Times New Roman" w:hAnsi="Times New Roman"/>
+          <w:color w:val="000000"/>
+          <w:sz w:val="28"/>
+        </w:rPr>
+        <w:t>Рисунок 9 – Фильтрация истории полива</w:t>
+      </w:r>
+    </w:p>
+    <w:p>
+      <w:pPr>
+        <w:keepNext w:val="0"/>
+        <w:spacing w:before="0" w:after="0" w:line="240" w:lineRule="auto"/>
+        <w:ind w:firstLine="0" w:left="0" w:right="0"/>
+        <w:rPr>
+          <w:rFonts w:ascii="Times New Roman" w:hAnsi="Times New Roman" w:cs="Times New Roman"/>
+          <w:sz w:val="28"/>
+          <w:szCs w:val="28"/>
+        </w:rPr>
+      </w:pPr>
+      <w:r>
+        <w:rPr>
+          <w:rFonts w:ascii="Times New Roman" w:hAnsi="Times New Roman"/>
+          <w:color w:val="000000"/>
+          <w:sz w:val="28"/>
+        </w:rPr>
+      </w:r>
+    </w:p>
+    <w:p>
+      <w:pPr>
+        <w:spacing w:before="0" w:after="0" w:line="240" w:lineRule="auto"/>
+        <w:ind w:firstLine="709" w:left="0" w:right="0"/>
+        <w:jc w:val="both"/>
+        <w:rPr>
+          <w:rFonts w:ascii="Times New Roman" w:hAnsi="Times New Roman" w:cs="Times New Roman"/>
+          <w:sz w:val="28"/>
+          <w:szCs w:val="28"/>
+        </w:rPr>
+      </w:pPr>
+      <w:r>
+        <w:rPr>
+          <w:rFonts w:ascii="Times New Roman" w:hAnsi="Times New Roman"/>
+          <w:color w:val="000000"/>
+          <w:sz w:val="28"/>
+        </w:rPr>
+        <w:t>Для автоматизированного добавления создан экран распознавания этикетки. Пользователь может получить изображение через системную камеру, выбрать его из галереи либо использовать встроенный образец при работе в эмуляторе. Встроенные изображения содержат текстовые названия монстеры, фикуса и спатифиллума и проходят тот же распознаватель, что и снимок камеры. Набор источников изображения представлен на рисунке 10.</w:t>
+      </w:r>
+    </w:p>
+    <w:p>
+      <w:pPr>
+        <w:keepNext/>
+        <w:spacing w:before="0" w:after="0" w:line="240" w:lineRule="auto"/>
+        <w:ind w:firstLine="0" w:left="0" w:right="0"/>
+        <w:rPr>
+          <w:rFonts w:ascii="Times New Roman" w:hAnsi="Times New Roman" w:cs="Times New Roman"/>
+          <w:sz w:val="28"/>
+          <w:szCs w:val="28"/>
+        </w:rPr>
+      </w:pPr>
+      <w:r>
+        <w:rPr>
+          <w:rFonts w:ascii="Times New Roman" w:hAnsi="Times New Roman"/>
+          <w:color w:val="000000"/>
+          <w:sz w:val="28"/>
+        </w:rPr>
+      </w:r>
+    </w:p>
+    <w:p>
+      <w:pPr>
+        <w:keepNext/>
+        <w:spacing w:before="0" w:after="0" w:line="240" w:lineRule="auto"/>
+        <w:ind w:firstLine="0" w:left="0" w:right="0"/>
+        <w:jc w:val="center"/>
+        <w:rPr>
+          <w:rFonts w:ascii="Times New Roman" w:hAnsi="Times New Roman" w:cs="Times New Roman"/>
+          <w:sz w:val="28"/>
+          <w:szCs w:val="28"/>
+        </w:rPr>
+      </w:pPr>
+      <w:r>
+        <w:drawing>
+          <wp:inline xmlns:a="http://schemas.openxmlformats.org/drawingml/2006/main" xmlns:pic="http://schemas.openxmlformats.org/drawingml/2006/picture">
+            <wp:extent cx="2304000" cy="5117305"/>
+            <wp:docPr id="10" name="Picture 10"/>
+            <wp:cNvGraphicFramePr>
+              <a:graphicFrameLocks noChangeAspect="1"/>
+            </wp:cNvGraphicFramePr>
+            <a:graphic>
+              <a:graphicData uri="http://schemas.openxmlformats.org/drawingml/2006/picture">
+                <pic:pic>
+                  <pic:nvPicPr>
+                    <pic:cNvPr id="0" name="10_label_sources.png"/>
+                    <pic:cNvPicPr/>
+                  </pic:nvPicPr>
+                  <pic:blipFill>
+                    <a:blip r:embed="rId18"/>
+                    <a:stretch>
+                      <a:fillRect/>
+                    </a:stretch>
+                  </pic:blipFill>
+                  <pic:spPr>
+                    <a:xfrm>
+                      <a:off x="0" y="0"/>
+                      <a:ext cx="2304000" cy="5117305"/>
+                    </a:xfrm>
+                    <a:prstGeom prst="rect"/>
+                  </pic:spPr>
+                </pic:pic>
+              </a:graphicData>
+            </a:graphic>
+          </wp:inline>
+        </w:drawing>
+      </w:r>
+    </w:p>
+    <w:p>
+      <w:pPr>
+        <w:keepNext/>
+        <w:spacing w:before="0" w:after="0" w:line="240" w:lineRule="auto"/>
+        <w:ind w:firstLine="0" w:left="0" w:right="0"/>
+        <w:rPr>
+          <w:rFonts w:ascii="Times New Roman" w:hAnsi="Times New Roman" w:cs="Times New Roman"/>
+          <w:sz w:val="28"/>
+          <w:szCs w:val="28"/>
+        </w:rPr>
+      </w:pPr>
+      <w:r>
+        <w:rPr>
+          <w:rFonts w:ascii="Times New Roman" w:hAnsi="Times New Roman"/>
+          <w:color w:val="000000"/>
+          <w:sz w:val="28"/>
+        </w:rPr>
+      </w:r>
+    </w:p>
+    <w:p>
+      <w:pPr>
+        <w:keepLines/>
+        <w:spacing w:before="0" w:after="0" w:line="240" w:lineRule="auto"/>
+        <w:ind w:firstLine="0" w:left="0" w:right="0"/>
+        <w:jc w:val="center"/>
+        <w:rPr>
+          <w:rFonts w:ascii="Times New Roman" w:hAnsi="Times New Roman" w:cs="Times New Roman"/>
+          <w:sz w:val="28"/>
+          <w:szCs w:val="28"/>
+        </w:rPr>
+      </w:pPr>
+      <w:r>
+        <w:rPr>
+          <w:rFonts w:ascii="Times New Roman" w:hAnsi="Times New Roman"/>
+          <w:color w:val="000000"/>
+          <w:sz w:val="28"/>
+        </w:rPr>
+        <w:t>Рисунок 10 – Выбор источника изображения этикетки</w:t>
+      </w:r>
+    </w:p>
+    <w:p>
+      <w:pPr>
+        <w:keepNext w:val="0"/>
+        <w:spacing w:before="0" w:after="0" w:line="240" w:lineRule="auto"/>
+        <w:ind w:firstLine="0" w:left="0" w:right="0"/>
+        <w:rPr>
+          <w:rFonts w:ascii="Times New Roman" w:hAnsi="Times New Roman" w:cs="Times New Roman"/>
+          <w:sz w:val="28"/>
+          <w:szCs w:val="28"/>
+        </w:rPr>
+      </w:pPr>
+      <w:r>
+        <w:rPr>
+          <w:rFonts w:ascii="Times New Roman" w:hAnsi="Times New Roman"/>
+          <w:color w:val="000000"/>
+          <w:sz w:val="28"/>
+        </w:rPr>
+      </w:r>
+    </w:p>
+    <w:p>
+      <w:pPr>
+        <w:spacing w:before="0" w:after="0" w:line="240" w:lineRule="auto"/>
+        <w:ind w:firstLine="709" w:left="0" w:right="0"/>
+        <w:jc w:val="both"/>
+        <w:rPr>
+          <w:rFonts w:ascii="Times New Roman" w:hAnsi="Times New Roman" w:cs="Times New Roman"/>
+          <w:sz w:val="28"/>
+          <w:szCs w:val="28"/>
+        </w:rPr>
+      </w:pPr>
+      <w:r>
+        <w:rPr>
+          <w:rFonts w:ascii="Times New Roman" w:hAnsi="Times New Roman"/>
+          <w:color w:val="000000"/>
+          <w:sz w:val="28"/>
+        </w:rPr>
+        <w:t xml:space="preserve">Распознавание выполняется на устройстве с помощью </w:t>
+      </w:r>
+      <w:r>
+        <w:rPr>
+          <w:rFonts w:ascii="Times New Roman" w:hAnsi="Times New Roman"/>
+          <w:i/>
+          <w:color w:val="000000"/>
+          <w:sz w:val="28"/>
+        </w:rPr>
+        <w:t>Google</w:t>
+      </w:r>
+      <w:r>
+        <w:rPr>
+          <w:rFonts w:ascii="Times New Roman" w:hAnsi="Times New Roman"/>
+          <w:color w:val="000000"/>
+          <w:sz w:val="28"/>
+        </w:rPr>
+        <w:t xml:space="preserve"> </w:t>
+      </w:r>
+      <w:r>
+        <w:rPr>
+          <w:rFonts w:ascii="Times New Roman" w:hAnsi="Times New Roman"/>
+          <w:i/>
+          <w:color w:val="000000"/>
+          <w:sz w:val="28"/>
+        </w:rPr>
+        <w:t>ML</w:t>
+      </w:r>
+      <w:r>
+        <w:rPr>
+          <w:rFonts w:ascii="Times New Roman" w:hAnsi="Times New Roman"/>
+          <w:color w:val="000000"/>
+          <w:sz w:val="28"/>
+        </w:rPr>
+        <w:t xml:space="preserve"> </w:t>
+      </w:r>
+      <w:r>
+        <w:rPr>
+          <w:rFonts w:ascii="Times New Roman" w:hAnsi="Times New Roman"/>
+          <w:i/>
+          <w:color w:val="000000"/>
+          <w:sz w:val="28"/>
+        </w:rPr>
+        <w:t>Kit.</w:t>
+      </w:r>
+      <w:r>
+        <w:rPr>
+          <w:rFonts w:ascii="Times New Roman" w:hAnsi="Times New Roman"/>
+          <w:color w:val="000000"/>
+          <w:sz w:val="28"/>
+        </w:rPr>
+        <w:t xml:space="preserve"> В текущей реализации используется распознавание латинского письма, поэтому для съёмки требуется этикетка с латинским ботаническим названием. Метод </w:t>
+      </w:r>
+      <w:r>
+        <w:rPr>
+          <w:rFonts w:ascii="Times New Roman" w:hAnsi="Times New Roman"/>
+          <w:i/>
+          <w:color w:val="000000"/>
+          <w:sz w:val="28"/>
+        </w:rPr>
+        <w:t>suggestName</w:t>
+      </w:r>
+      <w:r>
+        <w:rPr>
+          <w:rFonts w:ascii="Times New Roman" w:hAnsi="Times New Roman"/>
+          <w:color w:val="000000"/>
+          <w:sz w:val="28"/>
+        </w:rPr>
+        <w:t xml:space="preserve"> класса </w:t>
+      </w:r>
+      <w:r>
+        <w:rPr>
+          <w:rFonts w:ascii="Times New Roman" w:hAnsi="Times New Roman"/>
+          <w:i/>
+          <w:color w:val="000000"/>
+          <w:sz w:val="28"/>
+        </w:rPr>
+        <w:t>LabelScanViewModel</w:t>
+      </w:r>
+      <w:r>
+        <w:rPr>
+          <w:rFonts w:ascii="Times New Roman" w:hAnsi="Times New Roman"/>
+          <w:color w:val="000000"/>
+          <w:sz w:val="28"/>
+        </w:rPr>
+        <w:t xml:space="preserve"> выделяет название из полученного текста, отдавая приоритет известному ботаническому имени. При обработке остальных строк исключаются строки с цифрами, обозначениями валюты и служебными словами. Цена не переносится в поля и не выводится в интерфейсе. Метод </w:t>
+      </w:r>
+      <w:r>
+        <w:rPr>
+          <w:rFonts w:ascii="Times New Roman" w:hAnsi="Times New Roman"/>
+          <w:i/>
+          <w:color w:val="000000"/>
+          <w:sz w:val="28"/>
+        </w:rPr>
+        <w:t>suggestSpecies</w:t>
+      </w:r>
+      <w:r>
+        <w:rPr>
+          <w:rFonts w:ascii="Times New Roman" w:hAnsi="Times New Roman"/>
+          <w:color w:val="000000"/>
+          <w:sz w:val="28"/>
+        </w:rPr>
+        <w:t xml:space="preserve"> заполняет поле вида только при наличии ботанического имени на этикетке. Перед добавлением пользователь проверяет и при необходимости исправляет 2 поля: название и вид растения. Кнопка подтверждения передаёт в каталог только эти значения. Комната, условия содержания и даты процедур на основании изображения не определяются. Результат обработки изображения монстеры представлен на рисунке 11.</w:t>
+      </w:r>
+    </w:p>
+    <w:p>
+      <w:pPr>
+        <w:keepNext/>
+        <w:spacing w:before="0" w:after="0" w:line="240" w:lineRule="auto"/>
+        <w:ind w:firstLine="0" w:left="0" w:right="0"/>
+        <w:rPr>
+          <w:rFonts w:ascii="Times New Roman" w:hAnsi="Times New Roman" w:cs="Times New Roman"/>
+          <w:sz w:val="28"/>
+          <w:szCs w:val="28"/>
+        </w:rPr>
+      </w:pPr>
+      <w:r>
+        <w:rPr>
+          <w:rFonts w:ascii="Times New Roman" w:hAnsi="Times New Roman"/>
+          <w:color w:val="000000"/>
+          <w:sz w:val="28"/>
+        </w:rPr>
+      </w:r>
+    </w:p>
+    <w:p>
+      <w:pPr>
+        <w:keepNext/>
+        <w:spacing w:before="0" w:after="0" w:line="240" w:lineRule="auto"/>
+        <w:ind w:firstLine="0" w:left="0" w:right="0"/>
+        <w:jc w:val="center"/>
+        <w:rPr>
+          <w:rFonts w:ascii="Times New Roman" w:hAnsi="Times New Roman" w:cs="Times New Roman"/>
+          <w:sz w:val="28"/>
+          <w:szCs w:val="28"/>
+        </w:rPr>
+      </w:pPr>
+      <w:r>
+        <w:drawing>
+          <wp:inline xmlns:a="http://schemas.openxmlformats.org/drawingml/2006/main" xmlns:pic="http://schemas.openxmlformats.org/drawingml/2006/picture">
+            <wp:extent cx="2304000" cy="5117305"/>
+            <wp:docPr id="11" name="Picture 11"/>
+            <wp:cNvGraphicFramePr>
+              <a:graphicFrameLocks noChangeAspect="1"/>
+            </wp:cNvGraphicFramePr>
+            <a:graphic>
+              <a:graphicData uri="http://schemas.openxmlformats.org/drawingml/2006/picture">
+                <pic:pic>
+                  <pic:nvPicPr>
+                    <pic:cNvPr id="0" name="11_label_result.png"/>
+                    <pic:cNvPicPr/>
+                  </pic:nvPicPr>
+                  <pic:blipFill>
+                    <a:blip r:embed="rId19"/>
+                    <a:stretch>
+                      <a:fillRect/>
+                    </a:stretch>
+                  </pic:blipFill>
+                  <pic:spPr>
+                    <a:xfrm>
+                      <a:off x="0" y="0"/>
+                      <a:ext cx="2304000" cy="5117305"/>
+                    </a:xfrm>
+                    <a:prstGeom prst="rect"/>
+                  </pic:spPr>
+                </pic:pic>
+              </a:graphicData>
+            </a:graphic>
+          </wp:inline>
+        </w:drawing>
+      </w:r>
+    </w:p>
+    <w:p>
+      <w:pPr>
+        <w:keepNext/>
+        <w:spacing w:before="0" w:after="0" w:line="240" w:lineRule="auto"/>
+        <w:ind w:firstLine="0" w:left="0" w:right="0"/>
+        <w:rPr>
+          <w:rFonts w:ascii="Times New Roman" w:hAnsi="Times New Roman" w:cs="Times New Roman"/>
+          <w:sz w:val="28"/>
+          <w:szCs w:val="28"/>
+        </w:rPr>
+      </w:pPr>
+      <w:r>
+        <w:rPr>
+          <w:rFonts w:ascii="Times New Roman" w:hAnsi="Times New Roman"/>
+          <w:color w:val="000000"/>
+          <w:sz w:val="28"/>
+        </w:rPr>
+      </w:r>
+    </w:p>
+    <w:p>
+      <w:pPr>
+        <w:keepLines/>
+        <w:spacing w:before="0" w:after="0" w:line="240" w:lineRule="auto"/>
+        <w:ind w:firstLine="0" w:left="0" w:right="0"/>
+        <w:jc w:val="center"/>
+        <w:rPr>
+          <w:rFonts w:ascii="Times New Roman" w:hAnsi="Times New Roman" w:cs="Times New Roman"/>
+          <w:sz w:val="28"/>
+          <w:szCs w:val="28"/>
+        </w:rPr>
+      </w:pPr>
+      <w:r>
+        <w:rPr>
+          <w:rFonts w:ascii="Times New Roman" w:hAnsi="Times New Roman"/>
+          <w:color w:val="000000"/>
+          <w:sz w:val="28"/>
+        </w:rPr>
+        <w:t>Рисунок 11 – Распознанное название и подтверждение добавления</w:t>
+      </w:r>
+    </w:p>
+    <w:p>
+      <w:pPr>
+        <w:keepNext w:val="0"/>
+        <w:spacing w:before="0" w:after="0" w:line="240" w:lineRule="auto"/>
+        <w:ind w:firstLine="0" w:left="0" w:right="0"/>
+        <w:rPr>
+          <w:rFonts w:ascii="Times New Roman" w:hAnsi="Times New Roman" w:cs="Times New Roman"/>
+          <w:sz w:val="28"/>
+          <w:szCs w:val="28"/>
+        </w:rPr>
+      </w:pPr>
+      <w:r>
+        <w:rPr>
+          <w:rFonts w:ascii="Times New Roman" w:hAnsi="Times New Roman"/>
+          <w:color w:val="000000"/>
+          <w:sz w:val="28"/>
+        </w:rPr>
+      </w:r>
+    </w:p>
+    <w:p>
+      <w:pPr>
+        <w:spacing w:before="0" w:after="0" w:line="240" w:lineRule="auto"/>
+        <w:ind w:firstLine="709" w:left="0" w:right="0"/>
+        <w:jc w:val="both"/>
+        <w:rPr>
+          <w:rFonts w:ascii="Times New Roman" w:hAnsi="Times New Roman" w:cs="Times New Roman"/>
+          <w:sz w:val="28"/>
+          <w:szCs w:val="28"/>
+        </w:rPr>
+      </w:pPr>
+      <w:r>
+        <w:rPr>
+          <w:rFonts w:ascii="Times New Roman" w:hAnsi="Times New Roman"/>
+          <w:color w:val="000000"/>
+          <w:sz w:val="28"/>
+        </w:rPr>
+        <w:t xml:space="preserve">Для дополнительной проверки в галерею эмулятора помещены фотографии растений и этикеток. На фотографии горшка с аглаонемой напечатано только название рода </w:t>
+      </w:r>
+      <w:r>
+        <w:rPr>
+          <w:rFonts w:ascii="Times New Roman" w:hAnsi="Times New Roman"/>
+          <w:i/>
+          <w:color w:val="000000"/>
+          <w:sz w:val="28"/>
+        </w:rPr>
+        <w:t>AGLAONEMA.</w:t>
+      </w:r>
+      <w:r>
+        <w:rPr>
+          <w:rFonts w:ascii="Times New Roman" w:hAnsi="Times New Roman"/>
+          <w:color w:val="000000"/>
+          <w:sz w:val="28"/>
+        </w:rPr>
+        <w:t xml:space="preserve"> После выбора изображения определяется название «Аглаонема», а поле «Вид растения» остаётся пустым. Ботанический вид не подставляется из справочника, поскольку на изображении он отсутствует. Результат проверки представлен на рисунке 12.</w:t>
+      </w:r>
+    </w:p>
+    <w:p>
+      <w:pPr>
+        <w:keepNext/>
+        <w:spacing w:before="0" w:after="0" w:line="240" w:lineRule="auto"/>
+        <w:ind w:firstLine="0" w:left="0" w:right="0"/>
+        <w:rPr>
+          <w:rFonts w:ascii="Times New Roman" w:hAnsi="Times New Roman" w:cs="Times New Roman"/>
+          <w:sz w:val="28"/>
+          <w:szCs w:val="28"/>
+        </w:rPr>
+      </w:pPr>
+      <w:r>
+        <w:rPr>
+          <w:rFonts w:ascii="Times New Roman" w:hAnsi="Times New Roman"/>
+          <w:color w:val="000000"/>
+          <w:sz w:val="28"/>
+        </w:rPr>
+      </w:r>
+    </w:p>
+    <w:p>
+      <w:pPr>
+        <w:keepNext/>
+        <w:spacing w:before="0" w:after="0" w:line="240" w:lineRule="auto"/>
+        <w:ind w:firstLine="0" w:left="0" w:right="0"/>
+        <w:jc w:val="center"/>
+        <w:rPr>
+          <w:rFonts w:ascii="Times New Roman" w:hAnsi="Times New Roman" w:cs="Times New Roman"/>
+          <w:sz w:val="28"/>
+          <w:szCs w:val="28"/>
+        </w:rPr>
+      </w:pPr>
+      <w:r>
+        <w:drawing>
+          <wp:inline xmlns:a="http://schemas.openxmlformats.org/drawingml/2006/main" xmlns:pic="http://schemas.openxmlformats.org/drawingml/2006/picture">
+            <wp:extent cx="2304000" cy="5120000"/>
+            <wp:docPr id="12" name="Picture 12"/>
+            <wp:cNvGraphicFramePr>
+              <a:graphicFrameLocks noChangeAspect="1"/>
+            </wp:cNvGraphicFramePr>
+            <a:graphic>
+              <a:graphicData uri="http://schemas.openxmlformats.org/drawingml/2006/picture">
+                <pic:pic>
+                  <pic:nvPicPr>
+                    <pic:cNvPr id="0" name="12_label_name_only.png"/>
+                    <pic:cNvPicPr/>
+                  </pic:nvPicPr>
+                  <pic:blipFill>
+                    <a:blip r:embed="rId20"/>
+                    <a:stretch>
+                      <a:fillRect/>
+                    </a:stretch>
+                  </pic:blipFill>
+                  <pic:spPr>
+                    <a:xfrm>
+                      <a:off x="0" y="0"/>
+                      <a:ext cx="2304000" cy="5120000"/>
+                    </a:xfrm>
+                    <a:prstGeom prst="rect"/>
+                  </pic:spPr>
+                </pic:pic>
+              </a:graphicData>
+            </a:graphic>
+          </wp:inline>
+        </w:drawing>
+      </w:r>
+    </w:p>
+    <w:p>
+      <w:pPr>
+        <w:keepNext/>
+        <w:spacing w:before="0" w:after="0" w:line="240" w:lineRule="auto"/>
+        <w:ind w:firstLine="0" w:left="0" w:right="0"/>
+        <w:rPr>
+          <w:rFonts w:ascii="Times New Roman" w:hAnsi="Times New Roman" w:cs="Times New Roman"/>
+          <w:sz w:val="28"/>
+          <w:szCs w:val="28"/>
+        </w:rPr>
+      </w:pPr>
+      <w:r>
+        <w:rPr>
+          <w:rFonts w:ascii="Times New Roman" w:hAnsi="Times New Roman"/>
+          <w:color w:val="000000"/>
+          <w:sz w:val="28"/>
+        </w:rPr>
+      </w:r>
+    </w:p>
+    <w:p>
+      <w:pPr>
+        <w:keepLines/>
+        <w:spacing w:before="0" w:after="0" w:line="240" w:lineRule="auto"/>
+        <w:ind w:firstLine="0" w:left="0" w:right="0"/>
+        <w:jc w:val="center"/>
+        <w:rPr>
+          <w:rFonts w:ascii="Times New Roman" w:hAnsi="Times New Roman" w:cs="Times New Roman"/>
+          <w:sz w:val="28"/>
+          <w:szCs w:val="28"/>
+        </w:rPr>
+      </w:pPr>
+      <w:r>
+        <w:rPr>
+          <w:rFonts w:ascii="Times New Roman" w:hAnsi="Times New Roman"/>
+          <w:color w:val="000000"/>
+          <w:sz w:val="28"/>
+        </w:rPr>
+        <w:t>Рисунок 12 – Распознавание названия без указанного вида</w:t>
+      </w:r>
+    </w:p>
+    <w:p>
+      <w:pPr>
+        <w:keepNext w:val="0"/>
+        <w:spacing w:before="0" w:after="0" w:line="240" w:lineRule="auto"/>
+        <w:ind w:firstLine="0" w:left="0" w:right="0"/>
+        <w:rPr>
+          <w:rFonts w:ascii="Times New Roman" w:hAnsi="Times New Roman" w:cs="Times New Roman"/>
+          <w:sz w:val="28"/>
+          <w:szCs w:val="28"/>
+        </w:rPr>
+      </w:pPr>
+      <w:r>
+        <w:rPr>
+          <w:rFonts w:ascii="Times New Roman" w:hAnsi="Times New Roman"/>
+          <w:color w:val="000000"/>
+          <w:sz w:val="28"/>
+        </w:rPr>
+      </w:r>
+    </w:p>
+    <w:p>
+      <w:pPr>
+        <w:spacing w:before="0" w:after="0" w:line="240" w:lineRule="auto"/>
+        <w:ind w:firstLine="709" w:left="0" w:right="0"/>
+        <w:jc w:val="both"/>
+        <w:rPr>
+          <w:rFonts w:ascii="Times New Roman" w:hAnsi="Times New Roman" w:cs="Times New Roman"/>
+          <w:sz w:val="28"/>
+          <w:szCs w:val="28"/>
+        </w:rPr>
+      </w:pPr>
+      <w:r>
+        <w:rPr>
+          <w:rFonts w:ascii="Times New Roman" w:hAnsi="Times New Roman"/>
+          <w:color w:val="000000"/>
+          <w:sz w:val="28"/>
+        </w:rPr>
+        <w:t xml:space="preserve">На другой фотографии этикетка содержит ботаническое имя </w:t>
+      </w:r>
+      <w:r>
+        <w:rPr>
+          <w:rFonts w:ascii="Times New Roman" w:hAnsi="Times New Roman"/>
+          <w:i/>
+          <w:color w:val="000000"/>
+          <w:sz w:val="28"/>
+        </w:rPr>
+        <w:t>Aglaonema</w:t>
+      </w:r>
+      <w:r>
+        <w:rPr>
+          <w:rFonts w:ascii="Times New Roman" w:hAnsi="Times New Roman"/>
+          <w:color w:val="000000"/>
+          <w:sz w:val="28"/>
+        </w:rPr>
+        <w:t xml:space="preserve"> </w:t>
+      </w:r>
+      <w:r>
+        <w:rPr>
+          <w:rFonts w:ascii="Times New Roman" w:hAnsi="Times New Roman"/>
+          <w:i/>
+          <w:color w:val="000000"/>
+          <w:sz w:val="28"/>
+        </w:rPr>
+        <w:t>commutatum.</w:t>
+      </w:r>
+      <w:r>
+        <w:rPr>
+          <w:rFonts w:ascii="Times New Roman" w:hAnsi="Times New Roman"/>
+          <w:color w:val="000000"/>
+          <w:sz w:val="28"/>
+        </w:rPr>
+        <w:t xml:space="preserve"> После обработки изображения заполнены название «Аглаонема» и соответствующий вид растения. Полученные данные доступны для исправления перед добавлением. После подтверждения условия содержания можно заполнить через форму редактирования растения. Результат распознавания этикетки с указанным видом представлен на рисунке 13.</w:t>
+      </w:r>
+    </w:p>
+    <w:p>
+      <w:pPr>
+        <w:keepNext/>
+        <w:spacing w:before="0" w:after="0" w:line="240" w:lineRule="auto"/>
+        <w:ind w:firstLine="0" w:left="0" w:right="0"/>
+        <w:rPr>
+          <w:rFonts w:ascii="Times New Roman" w:hAnsi="Times New Roman" w:cs="Times New Roman"/>
+          <w:sz w:val="28"/>
+          <w:szCs w:val="28"/>
+        </w:rPr>
+      </w:pPr>
+      <w:r>
+        <w:rPr>
+          <w:rFonts w:ascii="Times New Roman" w:hAnsi="Times New Roman"/>
+          <w:color w:val="000000"/>
+          <w:sz w:val="28"/>
+        </w:rPr>
+      </w:r>
+    </w:p>
+    <w:p>
+      <w:pPr>
+        <w:keepNext/>
+        <w:spacing w:before="0" w:after="0" w:line="240" w:lineRule="auto"/>
+        <w:ind w:firstLine="0" w:left="0" w:right="0"/>
+        <w:jc w:val="center"/>
+        <w:rPr>
+          <w:rFonts w:ascii="Times New Roman" w:hAnsi="Times New Roman" w:cs="Times New Roman"/>
+          <w:sz w:val="28"/>
+          <w:szCs w:val="28"/>
+        </w:rPr>
+      </w:pPr>
+      <w:r>
+        <w:drawing>
+          <wp:inline xmlns:a="http://schemas.openxmlformats.org/drawingml/2006/main" xmlns:pic="http://schemas.openxmlformats.org/drawingml/2006/picture">
+            <wp:extent cx="2304000" cy="5120000"/>
+            <wp:docPr id="13" name="Picture 13"/>
+            <wp:cNvGraphicFramePr>
+              <a:graphicFrameLocks noChangeAspect="1"/>
+            </wp:cNvGraphicFramePr>
+            <a:graphic>
+              <a:graphicData uri="http://schemas.openxmlformats.org/drawingml/2006/picture">
+                <pic:pic>
+                  <pic:nvPicPr>
+                    <pic:cNvPr id="0" name="13_label_species.png"/>
+                    <pic:cNvPicPr/>
+                  </pic:nvPicPr>
+                  <pic:blipFill>
+                    <a:blip r:embed="rId21"/>
+                    <a:stretch>
+                      <a:fillRect/>
+                    </a:stretch>
+                  </pic:blipFill>
+                  <pic:spPr>
+                    <a:xfrm>
+                      <a:off x="0" y="0"/>
+                      <a:ext cx="2304000" cy="5120000"/>
+                    </a:xfrm>
+                    <a:prstGeom prst="rect"/>
+                  </pic:spPr>
+                </pic:pic>
+              </a:graphicData>
+            </a:graphic>
+          </wp:inline>
+        </w:drawing>
+      </w:r>
+    </w:p>
+    <w:p>
+      <w:pPr>
+        <w:keepNext/>
+        <w:spacing w:before="0" w:after="0" w:line="240" w:lineRule="auto"/>
+        <w:ind w:firstLine="0" w:left="0" w:right="0"/>
+        <w:rPr>
+          <w:rFonts w:ascii="Times New Roman" w:hAnsi="Times New Roman" w:cs="Times New Roman"/>
+          <w:sz w:val="28"/>
+          <w:szCs w:val="28"/>
+        </w:rPr>
+      </w:pPr>
+      <w:r>
+        <w:rPr>
+          <w:rFonts w:ascii="Times New Roman" w:hAnsi="Times New Roman"/>
+          <w:color w:val="000000"/>
+          <w:sz w:val="28"/>
+        </w:rPr>
+      </w:r>
+    </w:p>
+    <w:p>
+      <w:pPr>
+        <w:keepLines/>
+        <w:spacing w:before="0" w:after="0" w:line="240" w:lineRule="auto"/>
+        <w:ind w:firstLine="0" w:left="0" w:right="0"/>
+        <w:jc w:val="center"/>
+        <w:rPr>
+          <w:rFonts w:ascii="Times New Roman" w:hAnsi="Times New Roman" w:cs="Times New Roman"/>
+          <w:sz w:val="28"/>
+          <w:szCs w:val="28"/>
+        </w:rPr>
+      </w:pPr>
+      <w:r>
+        <w:rPr>
+          <w:rFonts w:ascii="Times New Roman" w:hAnsi="Times New Roman"/>
+          <w:color w:val="000000"/>
+          <w:sz w:val="28"/>
+        </w:rPr>
+        <w:t>Рисунок 13 – Распознавание названия и указанного на этикетке вида</w:t>
       </w:r>
     </w:p>
     <w:p>
@@ -2439,7 +3419,7 @@
           <w:color w:val="000000"/>
           <w:sz w:val="28"/>
         </w:rPr>
-        <w:t>Ниже приведён фрагмент модели недельной процедуры. Дата начала ограничивает период повторений, а совпадение дня недели задаёт интервал в семь календарных дней.</w:t>
+        <w:t>Ниже приведён фрагмент модели недельной процедуры. Дата начала ограничивает период повторений, а совпадение дня недели задаёт интервал в 7 календарных дней.</w:t>
       </w:r>
     </w:p>
     <w:p>
@@ -2516,7 +3496,7 @@
           <w:color w:val="000000"/>
           <w:sz w:val="28"/>
         </w:rPr>
-        <w:t>BotanicalProfile.</w:t>
+        <w:t>BotanicalProfile</w:t>
       </w:r>
       <w:r>
         <w:rPr>
@@ -2524,7 +3504,7 @@
           <w:color w:val="000000"/>
           <w:sz w:val="28"/>
         </w:rPr>
-        <w:t xml:space="preserve"> Это пример чтения структурированных данных текущего этапа; постоянная база данных пока не используется.</w:t>
+        <w:t xml:space="preserve"> и повторно используется после первого чтения. Для сопоставления игнорируются регистр букв и пробелы по краям, затем проверяются вид и название растения. Это чтение включённых в приложение структурированных данных; постоянная база данных пока не используется.</w:t>
       </w:r>
     </w:p>
     <w:p>
@@ -2740,7 +3720,41 @@
           <w:color w:val="000000"/>
           <w:sz w:val="28"/>
         </w:rPr>
-        <w:t>Обработка изображения выполняется асинхронно. Во время распознавания действия временно недоступны, а интерфейс показывает индикатор выполнения. Полученный текст передаётся модели представления для выделения и подтверждения названия.</w:t>
+        <w:t xml:space="preserve">Обработка изображения выполняется асинхронно на устройстве. Для выбора снимка используется </w:t>
+      </w:r>
+      <w:r>
+        <w:rPr>
+          <w:rFonts w:ascii="Times New Roman" w:hAnsi="Times New Roman"/>
+          <w:i/>
+          <w:color w:val="000000"/>
+          <w:sz w:val="28"/>
+        </w:rPr>
+        <w:t>image_picker</w:t>
+      </w:r>
+      <w:r>
+        <w:rPr>
+          <w:rFonts w:ascii="Times New Roman" w:hAnsi="Times New Roman"/>
+          <w:color w:val="000000"/>
+          <w:sz w:val="28"/>
+        </w:rPr>
+        <w:t xml:space="preserve">, а для распознавания – </w:t>
+      </w:r>
+      <w:r>
+        <w:rPr>
+          <w:rFonts w:ascii="Times New Roman" w:hAnsi="Times New Roman"/>
+          <w:i/>
+          <w:color w:val="000000"/>
+          <w:sz w:val="28"/>
+        </w:rPr>
+        <w:t>google_mlkit_text_recognition.</w:t>
+      </w:r>
+      <w:r>
+        <w:rPr>
+          <w:rFonts w:ascii="Times New Roman" w:hAnsi="Times New Roman"/>
+          <w:color w:val="000000"/>
+          <w:sz w:val="28"/>
+        </w:rPr>
+        <w:t xml:space="preserve"> Модель распознавания включена в приложение, поэтому сетевой запрос не требуется. Во время распознавания действия временно недоступны, а интерфейс показывает индикатор выполнения. Полученный текст передаётся модели представления для выделения и подтверждения названия.</w:t>
       </w:r>
     </w:p>
     <w:p>
@@ -2815,7 +3829,7 @@
           <w:color w:val="000000"/>
           <w:sz w:val="28"/>
         </w:rPr>
-        <w:t xml:space="preserve"> статический анализ завершился без замечаний. Двадцать автоматических тестов проверяют календарные границы, недельные повторения, операции с растениями и процедурами, историю ухода, отмену полива, поиск ботанической справки и выделение названия из распознанного текста. Дополнительный сценарий в эмуляторе </w:t>
+        <w:t xml:space="preserve"> статический анализ завершился без замечаний. 26 автоматических проверок охватывают календарные границы, недельные повторения, операции с растениями и процедурами, историю ухода, отмену полива, поиск ботанической справки, выделение названия без цены, заполнение вида только при наличии на этикетке, сохранение и редактирование условий содержания, а также приоритет пользовательской справки. Дополнительный сценарий в эмуляторе </w:t>
       </w:r>
       <w:r>
         <w:rPr>
@@ -2832,7 +3846,7 @@
           <w:color w:val="000000"/>
           <w:sz w:val="28"/>
         </w:rPr>
-        <w:t xml:space="preserve"> проверяет настоящее распознавание трёх встроенных изображений, создание серии, просмотр следующего повторения, ввод и фильтрацию записи журнала, а также добавление распознанного растения. Снимки получены из работающего приложения. Сценарий съёмки физической этикетки на реальном телефоне не проверялся; для демонстрации использованы встроенные изображения.</w:t>
+        <w:t xml:space="preserve"> проверяет настоящее распознавание 3 встроенных изображений, создание серии, просмотр следующего повторения, ввод и фильтрацию записи журнала, добавление распознанного растения, ручной ввод и изменение условий содержания с последующим просмотром справки. Отдельно проверен выбор фотографий из системной галереи: изображение только с названием рода, этикетка с ботаническим видом и образец с ценой. Снимки получены из работающего приложения. Съёмка физической этикетки камерой реального телефона не проверялась.</w:t>
       </w:r>
     </w:p>
     <w:p>
@@ -3418,7 +4432,7 @@
           <w:color w:val="000000"/>
           <w:sz w:val="28"/>
         </w:rPr>
-        <w:t xml:space="preserve">Вывод: выполнена функциональная часть второй лабораторной работы для варианта 7. Созданы журнал поливов, подкормок и пересадок, ботаническая справка и распознавание текстового названия с этикетки. Дополнительно реализовано еженедельное повторение назначенных процедур. Модели, состояние приложения и интерфейс разделены в соответствии с архитектурой </w:t>
+        <w:t xml:space="preserve">Вывод: выполнена функциональная часть второй лабораторной работы для варианта 7. Созданы журнал поливов, подкормок и пересадок, справка об условиях содержания и распознавание текстового названия с этикетки. Условия содержания можно вводить и редактировать самостоятельно. По изображению заполняются только название и присутствующий на этикетке вид растения; цена не отображается. Дополнительно реализовано еженедельное повторение назначенных процедур. Модели, состояние приложения и интерфейс разделены в соответствии с архитектурой </w:t>
       </w:r>
       <w:r>
         <w:rPr>

</xml_diff>